<commit_message>
Arizaga uchta telefon raqami, muqova mijoz tanlagan ko'rinishda
Qarz oluvchidan uchta telefon raqami so'raladi, uchalasi ham majburiy —
arizadagi «Телефон ракам 1) 2) 3)» o'rinlariga tushadi. Birinchisi
shartnomaning 9-bandidagi «Қарз олувчи» rekvizitlarida ham qoladi.

Raqam qanday yozilsa ham bir ko'rinishga keladi (telefon_tozala):
«+998(90)1234567», «901234567» -> «90 123-45-67».

Muqova mijoz tanlagan ko'rinishga o'tdi:
- tashkilot nomi qalin, kursivsiz, yengil soya bilan
- «масъулияти чекланган жамияти» qatori olib tashlandi
- ma'lumotlar ramkali quti ichida: kredit raqami, sana/muddat,
  summa, foiz va garov turi

Quti chegarasi «Table Grid» uslubi orqali emas, to'g'ridan-to'g'ri
tblBorders bilan beriladi: muqova shartnoma hujjatining ichiga
qo'yiladi, u yerda bu uslub yo'q — chegara ko'rinmay qolardi.

Co-Authored-By: Claude Opus 5 <noreply@anthropic.com>
</commit_message>
<xml_diff>
--- a/contracts/shablonlar/kafillik.docx
+++ b/contracts/shablonlar/kafillik.docx
@@ -4866,7 +4866,7 @@
         </w:rPr>
       </w:pPr>
       <w:r>
-        <w:t>Телефон ракам  1) {{ telefon }}</w:t>
+        <w:t>Телефон ракам  1) {{ telefon }} 2) {{ telefon2 }} 3) {{ telefon3 }}</w:t>
       </w:r>
       <w:r/>
       <w:r>
@@ -4890,14 +4890,12 @@
           <w:color w:val="FF0000"/>
           <w:lang w:val="en-US"/>
         </w:rPr>
-        <w:t xml:space="preserve"> 2) _______________</w:t>
-      </w:r>
-      <w:r>
-        <w:rPr>
-          <w:b/>
-          <w:color w:val="FF0000"/>
-        </w:rPr>
-        <w:t>_____ 3) ___________________</w:t>
+      </w:r>
+      <w:r>
+        <w:rPr>
+          <w:b/>
+          <w:color w:val="FF0000"/>
+        </w:rPr>
       </w:r>
     </w:p>
     <w:p>

</xml_diff>

<commit_message>
Arizaga ish joyi maydoni
«Менинг иш жойим ва унинг манзили» qatori bo'sh chiziq bo'lib qolib
ketgan edi. Endi formadagi «Ish joyi va manzili» maydonidan to'ldiriladi,
to'ldirish majburiy (ishlamasa «—» qo'yiladi).

Co-Authored-By: Claude Opus 5 <noreply@anthropic.com>
</commit_message>
<xml_diff>
--- a/contracts/shablonlar/kafillik.docx
+++ b/contracts/shablonlar/kafillik.docx
@@ -4911,64 +4911,34 @@
       </w:r>
       <w:proofErr w:type="spellStart"/>
       <w:r>
-        <w:t>Менинг</w:t>
+        <w:t>Менинг иш жойим ва унинг манзили: {{ ish_joyi }}</w:t>
       </w:r>
       <w:proofErr w:type="spellEnd"/>
-      <w:r>
-        <w:t xml:space="preserve"> </w:t>
-      </w:r>
+      <w:r/>
       <w:proofErr w:type="spellStart"/>
-      <w:r>
-        <w:t>иш</w:t>
-      </w:r>
+      <w:r/>
       <w:proofErr w:type="spellEnd"/>
-      <w:r>
-        <w:t xml:space="preserve"> </w:t>
-      </w:r>
+      <w:r/>
       <w:proofErr w:type="spellStart"/>
-      <w:r>
-        <w:t>жойим</w:t>
-      </w:r>
+      <w:r/>
       <w:proofErr w:type="spellEnd"/>
-      <w:r>
-        <w:t xml:space="preserve"> </w:t>
-      </w:r>
+      <w:r/>
       <w:proofErr w:type="spellStart"/>
-      <w:r>
-        <w:t>ва</w:t>
-      </w:r>
+      <w:r/>
       <w:proofErr w:type="spellEnd"/>
-      <w:r>
-        <w:t xml:space="preserve"> </w:t>
-      </w:r>
+      <w:r/>
       <w:proofErr w:type="spellStart"/>
-      <w:r>
-        <w:t>унинг</w:t>
-      </w:r>
+      <w:r/>
       <w:proofErr w:type="spellEnd"/>
-      <w:r>
-        <w:t xml:space="preserve"> </w:t>
-      </w:r>
+      <w:r/>
       <w:proofErr w:type="spellStart"/>
-      <w:r>
-        <w:t>манзили</w:t>
-      </w:r>
+      <w:r/>
       <w:proofErr w:type="spellEnd"/>
-      <w:r>
-        <w:t>:</w:t>
-      </w:r>
-      <w:r>
-        <w:t xml:space="preserve"> </w:t>
-      </w:r>
-      <w:r>
-        <w:t>_____________________________________</w:t>
-      </w:r>
-      <w:r>
-        <w:t>_____</w:t>
-      </w:r>
-      <w:r>
-        <w:t>_________</w:t>
-      </w:r>
+      <w:r/>
+      <w:r/>
+      <w:r/>
+      <w:r/>
+      <w:r/>
     </w:p>
     <w:p/>
     <w:p>

</xml_diff>

<commit_message>
Xaridorning 2026-08-14 kechqurungi izohlari
- Garov shartnomasi yana asosiy shartnoma raqamida (alohida raqam bekor
  qilindi; ustun bazada eskirgan holda qoldi).
- Garov shartnomasi 1.3-bandi: «келишув далолатномаси» o'rniga
  «№N-сонли бахолаш далолатномаси».
- Arizada har telefon raqamdan keyin tab.
- Garov suratlari: yuklash formada, hujjat oxirida chiqadi (GarovRasm
  modeli, MEDIA_ROOT/media).
- Muqova endi to'plamning eng oxirida: shartnoma -> garov -> dalolatnoma ->
  ariza -> bayon -> jadval -> suratlar -> muqova.

Co-Authored-By: Claude Opus 5 <noreply@anthropic.com>
</commit_message>
<xml_diff>
--- a/contracts/shablonlar/kafillik.docx
+++ b/contracts/shablonlar/kafillik.docx
@@ -4880,7 +4880,12 @@
         </w:rPr>
       </w:pPr>
       <w:r>
-        <w:t>Телефон ракам  1) {{ telefon }} 2) {{ telefon2 }} 3) {{ telefon3 }}</w:t>
+        <w:t>Телефон ракам  1) {{ telefon }}</w:t>
+        <w:tab/>
+        <w:t xml:space="preserve"> 2) {{ telefon2 }}</w:t>
+        <w:tab/>
+        <w:t xml:space="preserve"> 3) {{ telefon3 }}</w:t>
+        <w:tab/>
       </w:r>
       <w:r/>
       <w:r>

</xml_diff>